<commit_message>
Continue the Crypto Failure thm ctf
</commit_message>
<xml_diff>
--- a/THM_challenges/Medium/Crypto Failures/Crypto_Failures_Solution_Documentation.docx
+++ b/THM_challenges/Medium/Crypto Failures/Crypto_Failures_Solution_Documentation.docx
@@ -1075,13 +1075,8 @@
       <w:r>
         <w:t xml:space="preserve"> chose for me was “</w:t>
       </w:r>
-      <w:proofErr w:type="spellStart"/>
-      <w:r>
-        <w:t>sV</w:t>
-      </w:r>
-      <w:proofErr w:type="spellEnd"/>
-      <w:r>
-        <w:t>”</w:t>
+      <w:r>
+        <w:t>sV”</w:t>
       </w:r>
       <w:r>
         <w:t>:</w:t>
@@ -1168,7 +1163,13 @@
         <w:t xml:space="preserve">lower version </w:t>
       </w:r>
       <w:r>
-        <w:t>(I used here 3.6)</w:t>
+        <w:t xml:space="preserve">(I used here </w:t>
+      </w:r>
+      <w:r>
+        <w:t>an image of python 3.6</w:t>
+      </w:r>
+      <w:r>
+        <w:t>)</w:t>
       </w:r>
       <w:r>
         <w:t>.</w:t>
@@ -1177,15 +1178,535 @@
     <w:p>
       <w:r>
         <w:lastRenderedPageBreak/>
-        <w:t>Now, I created this substring “</w:t>
-      </w:r>
-      <w:proofErr w:type="spellStart"/>
-      <w:r>
-        <w:t>admin:Mo</w:t>
-      </w:r>
-      <w:proofErr w:type="spellEnd"/>
+        <w:t>Now, I created this substring “admin:Mo</w:t>
+      </w:r>
       <w:r>
         <w:t xml:space="preserve">” to </w:t>
+      </w:r>
+      <w:r>
+        <w:t xml:space="preserve">modify the </w:t>
+      </w:r>
+      <w:r>
+        <w:t>secure_</w:t>
+      </w:r>
+      <w:r>
+        <w:t>cookie</w:t>
+      </w:r>
+      <w:r>
+        <w:t xml:space="preserve">’s first hash </w:t>
+      </w:r>
+      <w:r>
+        <w:t xml:space="preserve">by hashing it </w:t>
+      </w:r>
+      <w:r>
+        <w:t xml:space="preserve">and </w:t>
+      </w:r>
+      <w:r>
+        <w:t>replace it with the first hash</w:t>
+      </w:r>
+      <w:r>
+        <w:t xml:space="preserve">. To </w:t>
+      </w:r>
+      <w:r>
+        <w:t xml:space="preserve">hash this </w:t>
+      </w:r>
+      <w:r>
+        <w:t>substring,</w:t>
+      </w:r>
+      <w:r>
+        <w:t xml:space="preserve"> I used this python </w:t>
+      </w:r>
+      <w:r>
+        <w:t>script:</w:t>
+      </w:r>
+    </w:p>
+    <w:p>
+      <w:r>
+        <w:drawing>
+          <wp:inline distT="0" distB="0" distL="0" distR="0" wp14:anchorId="561A1986" wp14:editId="42520B89">
+            <wp:extent cx="4198984" cy="1466977"/>
+            <wp:effectExtent l="0" t="0" r="0" b="0"/>
+            <wp:docPr id="608549737" name="תמונה 1"/>
+            <wp:cNvGraphicFramePr>
+              <a:graphicFrameLocks xmlns:a="http://schemas.openxmlformats.org/drawingml/2006/main" noChangeAspect="1"/>
+            </wp:cNvGraphicFramePr>
+            <a:graphic xmlns:a="http://schemas.openxmlformats.org/drawingml/2006/main">
+              <a:graphicData uri="http://schemas.openxmlformats.org/drawingml/2006/picture">
+                <pic:pic xmlns:pic="http://schemas.openxmlformats.org/drawingml/2006/picture">
+                  <pic:nvPicPr>
+                    <pic:cNvPr id="608549737" name=""/>
+                    <pic:cNvPicPr/>
+                  </pic:nvPicPr>
+                  <pic:blipFill>
+                    <a:blip r:embed="rId15"/>
+                    <a:stretch>
+                      <a:fillRect/>
+                    </a:stretch>
+                  </pic:blipFill>
+                  <pic:spPr>
+                    <a:xfrm>
+                      <a:off x="0" y="0"/>
+                      <a:ext cx="4198984" cy="1466977"/>
+                    </a:xfrm>
+                    <a:prstGeom prst="rect">
+                      <a:avLst/>
+                    </a:prstGeom>
+                  </pic:spPr>
+                </pic:pic>
+              </a:graphicData>
+            </a:graphic>
+          </wp:inline>
+        </w:drawing>
+      </w:r>
+    </w:p>
+    <w:p>
+      <w:r>
+        <w:drawing>
+          <wp:inline distT="0" distB="0" distL="0" distR="0" wp14:anchorId="26967B7D" wp14:editId="20764A50">
+            <wp:extent cx="2972058" cy="369602"/>
+            <wp:effectExtent l="0" t="0" r="0" b="0"/>
+            <wp:docPr id="2036392055" name="תמונה 1" descr="תמונה שמכילה טקסט, גופן, צילום מסך, גרפיקה&#10;&#10;תוכן בינה מלאכותית גנרטיבית עשוי להיות שגוי."/>
+            <wp:cNvGraphicFramePr>
+              <a:graphicFrameLocks xmlns:a="http://schemas.openxmlformats.org/drawingml/2006/main" noChangeAspect="1"/>
+            </wp:cNvGraphicFramePr>
+            <a:graphic xmlns:a="http://schemas.openxmlformats.org/drawingml/2006/main">
+              <a:graphicData uri="http://schemas.openxmlformats.org/drawingml/2006/picture">
+                <pic:pic xmlns:pic="http://schemas.openxmlformats.org/drawingml/2006/picture">
+                  <pic:nvPicPr>
+                    <pic:cNvPr id="2036392055" name="תמונה 1" descr="תמונה שמכילה טקסט, גופן, צילום מסך, גרפיקה&#10;&#10;תוכן בינה מלאכותית גנרטיבית עשוי להיות שגוי."/>
+                    <pic:cNvPicPr/>
+                  </pic:nvPicPr>
+                  <pic:blipFill>
+                    <a:blip r:embed="rId16"/>
+                    <a:stretch>
+                      <a:fillRect/>
+                    </a:stretch>
+                  </pic:blipFill>
+                  <pic:spPr>
+                    <a:xfrm>
+                      <a:off x="0" y="0"/>
+                      <a:ext cx="2972058" cy="369602"/>
+                    </a:xfrm>
+                    <a:prstGeom prst="rect">
+                      <a:avLst/>
+                    </a:prstGeom>
+                  </pic:spPr>
+                </pic:pic>
+              </a:graphicData>
+            </a:graphic>
+          </wp:inline>
+        </w:drawing>
+      </w:r>
+    </w:p>
+    <w:p>
+      <w:r>
+        <w:t>And I replace it as you can see:</w:t>
+      </w:r>
+    </w:p>
+    <w:p>
+      <w:pPr>
+        <w:rPr>
+          <w:b/>
+          <w:bCs/>
+          <w:u w:val="single"/>
+        </w:rPr>
+      </w:pPr>
+      <w:r>
+        <w:rPr>
+          <w:b/>
+          <w:bCs/>
+          <w:u w:val="single"/>
+        </w:rPr>
+        <w:t>Before:</w:t>
+      </w:r>
+    </w:p>
+    <w:p>
+      <w:r>
+        <w:rPr>
+          <w:color w:val="EE0000"/>
+        </w:rPr>
+        <w:t>sVN.6jdFakKuA</w:t>
+      </w:r>
+      <w:r>
+        <w:t>sVXBpRIH1Sf0osVKhmwHWXYTiosVhuuIrrH5q4YsVNSN2V5UUChwsV1XrRJyAxgsIsVewb1.bosZG6sVDJO0GC3PU5AsVJWiAPp.SBXMsVjW3zq9y1C6IsVjmAvObsJIzUsV3Lfcy2Ge8RgsVStwyAtw5fcYsVpALZQaFTEFUsVB1GxXC4EO8csVL5OXN6YhPYQsVbNd2rBqDk7MsVcN.FgYJyIUksVOvXTuQZgE5csVgDgmrbnU5CwsV1PtFDjSYrz.sV%2FMCx6OlKVSEsVe9k11YdwuhYsVTnIkDUiBfqQsVFPX%2FBintKtwsVX0thHjwY%2F5MsV57QtDaLumuIsVob0uwMgipBgsViUW9gB8ItMI</w:t>
+      </w:r>
+    </w:p>
+    <w:p>
+      <w:pPr>
+        <w:rPr>
+          <w:b/>
+          <w:bCs/>
+          <w:u w:val="single"/>
+        </w:rPr>
+      </w:pPr>
+      <w:r>
+        <w:rPr>
+          <w:b/>
+          <w:bCs/>
+          <w:u w:val="single"/>
+        </w:rPr>
+        <w:t>After:</w:t>
+      </w:r>
+    </w:p>
+    <w:p>
+      <w:r>
+        <w:rPr>
+          <w:color w:val="00B0F0"/>
+        </w:rPr>
+        <w:t>sVFiXtCkUM5t6</w:t>
+      </w:r>
+      <w:r>
+        <w:t>sVXBpRIH1Sf0osVKhmwHWXYTiosVhuuIrrH5q4YsVNSN2V5UUChwsV1XrRJyAxgsIsVewb1.bosZG6sVDJO0GC3PU5AsVJWiAPp.SBXMsVjW3zq9y1C6IsVjmAvObsJIzUsV3Lfcy2Ge8RgsVStwyAtw5fcYsVpALZQaFTEFUsVB1GxXC4EO8csVL5OXN6YhPYQsVbNd2rBqDk7MsVcN.FgYJyIUksVOvXTuQZgE5csVgDgmrbnU5CwsV1PtFDjSYrz.sV%2FMCx6OlKVSEsVe9k11YdwuhYsVTnIkDUiBfqQsVFPX%2FBintKtwsVX0thHjwY%2F5MsV57QtDaLumuIsVob0uwMgipBgsViUW9gB8ItMI</w:t>
+      </w:r>
+    </w:p>
+    <w:p>
+      <w:r>
+        <w:t xml:space="preserve">Now I replaced that new secure_cookie and change the user to </w:t>
+      </w:r>
+      <w:r>
+        <w:t>“</w:t>
+      </w:r>
+      <w:r>
+        <w:t>admin</w:t>
+      </w:r>
+      <w:r>
+        <w:t>”</w:t>
+      </w:r>
+      <w:r>
+        <w:t>:</w:t>
+      </w:r>
+    </w:p>
+    <w:p>
+      <w:r>
+        <w:drawing>
+          <wp:inline distT="0" distB="0" distL="0" distR="0" wp14:anchorId="3E4B1CEF" wp14:editId="4B1FF581">
+            <wp:extent cx="1665114" cy="304826"/>
+            <wp:effectExtent l="0" t="0" r="0" b="0"/>
+            <wp:docPr id="2045474689" name="תמונה 1" descr="תמונה שמכילה טקסט, צילום מסך, גופן&#10;&#10;תוכן בינה מלאכותית גנרטיבית עשוי להיות שגוי."/>
+            <wp:cNvGraphicFramePr>
+              <a:graphicFrameLocks xmlns:a="http://schemas.openxmlformats.org/drawingml/2006/main" noChangeAspect="1"/>
+            </wp:cNvGraphicFramePr>
+            <a:graphic xmlns:a="http://schemas.openxmlformats.org/drawingml/2006/main">
+              <a:graphicData uri="http://schemas.openxmlformats.org/drawingml/2006/picture">
+                <pic:pic xmlns:pic="http://schemas.openxmlformats.org/drawingml/2006/picture">
+                  <pic:nvPicPr>
+                    <pic:cNvPr id="2045474689" name="תמונה 1" descr="תמונה שמכילה טקסט, צילום מסך, גופן&#10;&#10;תוכן בינה מלאכותית גנרטיבית עשוי להיות שגוי."/>
+                    <pic:cNvPicPr/>
+                  </pic:nvPicPr>
+                  <pic:blipFill>
+                    <a:blip r:embed="rId17"/>
+                    <a:stretch>
+                      <a:fillRect/>
+                    </a:stretch>
+                  </pic:blipFill>
+                  <pic:spPr>
+                    <a:xfrm>
+                      <a:off x="0" y="0"/>
+                      <a:ext cx="1665114" cy="304826"/>
+                    </a:xfrm>
+                    <a:prstGeom prst="rect">
+                      <a:avLst/>
+                    </a:prstGeom>
+                  </pic:spPr>
+                </pic:pic>
+              </a:graphicData>
+            </a:graphic>
+          </wp:inline>
+        </w:drawing>
+      </w:r>
+    </w:p>
+    <w:p>
+      <w:r>
+        <w:t>And when I reload the page, it showed me the flag:</w:t>
+      </w:r>
+    </w:p>
+    <w:p>
+      <w:r>
+        <w:drawing>
+          <wp:inline distT="0" distB="0" distL="0" distR="0" wp14:anchorId="70511A9B" wp14:editId="7276AD55">
+            <wp:extent cx="4305673" cy="304826"/>
+            <wp:effectExtent l="0" t="0" r="0" b="0"/>
+            <wp:docPr id="342138485" name="תמונה 1"/>
+            <wp:cNvGraphicFramePr>
+              <a:graphicFrameLocks xmlns:a="http://schemas.openxmlformats.org/drawingml/2006/main" noChangeAspect="1"/>
+            </wp:cNvGraphicFramePr>
+            <a:graphic xmlns:a="http://schemas.openxmlformats.org/drawingml/2006/main">
+              <a:graphicData uri="http://schemas.openxmlformats.org/drawingml/2006/picture">
+                <pic:pic xmlns:pic="http://schemas.openxmlformats.org/drawingml/2006/picture">
+                  <pic:nvPicPr>
+                    <pic:cNvPr id="342138485" name=""/>
+                    <pic:cNvPicPr/>
+                  </pic:nvPicPr>
+                  <pic:blipFill>
+                    <a:blip r:embed="rId18"/>
+                    <a:stretch>
+                      <a:fillRect/>
+                    </a:stretch>
+                  </pic:blipFill>
+                  <pic:spPr>
+                    <a:xfrm>
+                      <a:off x="0" y="0"/>
+                      <a:ext cx="4305673" cy="304826"/>
+                    </a:xfrm>
+                    <a:prstGeom prst="rect">
+                      <a:avLst/>
+                    </a:prstGeom>
+                  </pic:spPr>
+                </pic:pic>
+              </a:graphicData>
+            </a:graphic>
+          </wp:inline>
+        </w:drawing>
+      </w:r>
+    </w:p>
+    <w:p>
+      <w:r>
+        <w:t xml:space="preserve">Now, </w:t>
+      </w:r>
+      <w:r>
+        <w:t xml:space="preserve">I </w:t>
+      </w:r>
+      <w:r>
+        <w:t>continued by</w:t>
+      </w:r>
+      <w:r>
+        <w:t xml:space="preserve"> looking for the </w:t>
+      </w:r>
+      <w:r>
+        <w:t xml:space="preserve">encryption </w:t>
+      </w:r>
+      <w:r>
+        <w:t>ke</w:t>
+      </w:r>
+      <w:r>
+        <w:t>y.</w:t>
+      </w:r>
+      <w:r>
+        <w:t xml:space="preserve"> </w:t>
+      </w:r>
+    </w:p>
+    <w:p>
+      <w:r>
+        <w:t xml:space="preserve">I saw the random </w:t>
+      </w:r>
+      <w:r>
+        <w:t>sub</w:t>
+      </w:r>
+      <w:r>
+        <w:t>string “</w:t>
+      </w:r>
+      <w:r>
+        <w:t>6cbe2bc</w:t>
+      </w:r>
+      <w:r>
+        <w:t xml:space="preserve">” that was </w:t>
+      </w:r>
+      <w:r>
+        <w:t xml:space="preserve">in </w:t>
+      </w:r>
+      <w:r>
+        <w:t>flag</w:t>
+      </w:r>
+      <w:r>
+        <w:t xml:space="preserve">, which </w:t>
+      </w:r>
+      <w:r>
+        <w:t>look</w:t>
+      </w:r>
+      <w:r>
+        <w:t>ed</w:t>
+      </w:r>
+      <w:r>
+        <w:t xml:space="preserve"> a bit </w:t>
+      </w:r>
+      <w:r>
+        <w:t>suspicious,</w:t>
+      </w:r>
+      <w:r>
+        <w:t xml:space="preserve"> so I kept it for </w:t>
+      </w:r>
+      <w:r>
+        <w:t>later.</w:t>
+      </w:r>
+      <w:r>
+        <w:t xml:space="preserve"> </w:t>
+      </w:r>
+    </w:p>
+    <w:p>
+      <w:r>
+        <w:t>In addition,</w:t>
+      </w:r>
+      <w:r>
+        <w:t xml:space="preserve"> I</w:t>
+      </w:r>
+      <w:r>
+        <w:t xml:space="preserve"> </w:t>
+      </w:r>
+      <w:r>
+        <w:t>thought to myself that maybe it</w:t>
+      </w:r>
+      <w:r>
+        <w:t xml:space="preserve"> will be</w:t>
+      </w:r>
+      <w:r>
+        <w:t xml:space="preserve"> possible to </w:t>
+      </w:r>
+      <w:r>
+        <w:t xml:space="preserve">run all the possibilities on each hash </w:t>
+      </w:r>
+      <w:r>
+        <w:t>th</w:t>
+      </w:r>
+      <w:r>
+        <w:t xml:space="preserve">at </w:t>
+      </w:r>
+      <w:r>
+        <w:t>con</w:t>
+      </w:r>
+      <w:r>
+        <w:t xml:space="preserve">tains the </w:t>
+      </w:r>
+      <w:r>
+        <w:t xml:space="preserve">secret key </w:t>
+      </w:r>
+      <w:r>
+        <w:t xml:space="preserve">using the salt but unfortunately </w:t>
+      </w:r>
+      <w:r>
+        <w:t>each hash have</w:t>
+      </w:r>
+      <w:r>
+        <w:t xml:space="preserve"> up to</w:t>
+      </w:r>
+      <w:r>
+        <w:t xml:space="preserve"> 65^8 </w:t>
+      </w:r>
+      <w:r>
+        <w:t xml:space="preserve">different possibilities because </w:t>
+      </w:r>
+      <w:r>
+        <w:t xml:space="preserve">the flag usually contains </w:t>
+      </w:r>
+      <w:r>
+        <w:t>number</w:t>
+      </w:r>
+      <w:r>
+        <w:t>s</w:t>
+      </w:r>
+      <w:r>
+        <w:t>, lowercase l</w:t>
+      </w:r>
+      <w:r>
+        <w:t>e</w:t>
+      </w:r>
+      <w:r>
+        <w:t>tter</w:t>
+      </w:r>
+      <w:r>
+        <w:t xml:space="preserve">s, </w:t>
+      </w:r>
+      <w:r>
+        <w:t>uppercase letters</w:t>
+      </w:r>
+      <w:r>
+        <w:t xml:space="preserve"> and (“{“, “}”, “_”)</w:t>
+      </w:r>
+      <w:r>
+        <w:t xml:space="preserve"> and </w:t>
+      </w:r>
+      <w:r>
+        <w:t xml:space="preserve">the </w:t>
+      </w:r>
+      <w:r>
+        <w:t xml:space="preserve">crypt function </w:t>
+      </w:r>
+      <w:r>
+        <w:t xml:space="preserve">maximum </w:t>
+      </w:r>
+      <w:r>
+        <w:t xml:space="preserve">receive </w:t>
+      </w:r>
+      <w:r>
+        <w:t xml:space="preserve">8 </w:t>
+      </w:r>
+      <w:r>
+        <w:t>chars</w:t>
+      </w:r>
+      <w:r>
+        <w:t xml:space="preserve"> string</w:t>
+      </w:r>
+      <w:r>
+        <w:t xml:space="preserve"> with salt of 2 chars</w:t>
+      </w:r>
+      <w:r>
+        <w:t>.</w:t>
+      </w:r>
+      <w:r>
+        <w:t xml:space="preserve"> </w:t>
+      </w:r>
+    </w:p>
+    <w:p>
+      <w:r>
+        <w:t>Therefore, I needed to go on a different strategy.</w:t>
+      </w:r>
+      <w:r>
+        <w:t xml:space="preserve"> I</w:t>
+      </w:r>
+      <w:r>
+        <w:t xml:space="preserve"> think for </w:t>
+      </w:r>
+      <w:r>
+        <w:t xml:space="preserve">couple of minutes and came up with an idea! What if I will change </w:t>
+      </w:r>
+      <w:r>
+        <w:t xml:space="preserve">the </w:t>
+      </w:r>
+      <w:r>
+        <w:t xml:space="preserve">User-Agent </w:t>
+      </w:r>
+      <w:r>
+        <w:t xml:space="preserve">any time I decrypt the </w:t>
+      </w:r>
+      <w:r>
+        <w:t xml:space="preserve">hash that connected </w:t>
+      </w:r>
+      <w:r>
+        <w:t>the user-agent, the “:” and the secret key so each time the part of the secret key will be one character long</w:t>
+      </w:r>
+      <w:r>
+        <w:t>.</w:t>
+      </w:r>
+    </w:p>
+    <w:p>
+      <w:r>
+        <w:lastRenderedPageBreak/>
+        <w:t xml:space="preserve">I </w:t>
+      </w:r>
+      <w:r>
+        <w:t>wrote this python script to</w:t>
+      </w:r>
+      <w:r>
+        <w:t xml:space="preserve"> </w:t>
+      </w:r>
+      <w:r>
+        <w:t>do this job:</w:t>
+      </w:r>
+    </w:p>
+    <w:p/>
+    <w:p>
+      <w:r>
+        <w:t>I run this script and finally found the secret key!</w:t>
+      </w:r>
+    </w:p>
+    <w:p/>
+    <w:p>
+      <w:r>
+        <w:t>And by doing so, I finished this challenge!</w:t>
+      </w:r>
+    </w:p>
+    <w:p>
+      <w:r>
+        <w:t xml:space="preserve"> </w:t>
       </w:r>
     </w:p>
     <w:sectPr>

</xml_diff>

<commit_message>
The Crypto Failure THM CTF was completed!
</commit_message>
<xml_diff>
--- a/THM_challenges/Medium/Crypto Failures/Crypto_Failures_Solution_Documentation.docx
+++ b/THM_challenges/Medium/Crypto Failures/Crypto_Failures_Solution_Documentation.docx
@@ -65,6 +65,9 @@
     </w:p>
     <w:p>
       <w:r>
+        <w:rPr>
+          <w:noProof/>
+        </w:rPr>
         <w:drawing>
           <wp:inline distT="0" distB="0" distL="0" distR="0" wp14:anchorId="5E129D44" wp14:editId="0B280F6D">
             <wp:extent cx="5239204" cy="1969941"/>
@@ -139,6 +142,9 @@
     </w:p>
     <w:p>
       <w:r>
+        <w:rPr>
+          <w:noProof/>
+        </w:rPr>
         <w:drawing>
           <wp:inline distT="0" distB="0" distL="0" distR="0" wp14:anchorId="2E2AF4D2" wp14:editId="40FEF647">
             <wp:extent cx="4896274" cy="1104996"/>
@@ -258,6 +264,9 @@
     </w:p>
     <w:p>
       <w:r>
+        <w:rPr>
+          <w:noProof/>
+        </w:rPr>
         <w:drawing>
           <wp:inline distT="0" distB="0" distL="0" distR="0" wp14:anchorId="5BCB80AC" wp14:editId="29143155">
             <wp:extent cx="5010584" cy="933531"/>
@@ -331,6 +340,9 @@
     </w:p>
     <w:p>
       <w:r>
+        <w:rPr>
+          <w:noProof/>
+        </w:rPr>
         <w:lastRenderedPageBreak/>
         <w:drawing>
           <wp:inline distT="0" distB="0" distL="0" distR="0" wp14:anchorId="06B56479" wp14:editId="77DC1A38">
@@ -390,6 +402,9 @@
     </w:p>
     <w:p>
       <w:r>
+        <w:rPr>
+          <w:noProof/>
+        </w:rPr>
         <w:drawing>
           <wp:inline distT="0" distB="0" distL="0" distR="0" wp14:anchorId="6DE111A7" wp14:editId="6E6F130D">
             <wp:extent cx="5410669" cy="1809907"/>
@@ -491,6 +506,9 @@
     </w:p>
     <w:p>
       <w:r>
+        <w:rPr>
+          <w:noProof/>
+        </w:rPr>
         <w:lastRenderedPageBreak/>
         <w:drawing>
           <wp:inline distT="0" distB="0" distL="0" distR="0" wp14:anchorId="024ADA9D" wp14:editId="0CB170A3">
@@ -566,6 +584,9 @@
     </w:p>
     <w:p>
       <w:r>
+        <w:rPr>
+          <w:noProof/>
+        </w:rPr>
         <w:drawing>
           <wp:inline distT="0" distB="0" distL="0" distR="0" wp14:anchorId="77C3793F" wp14:editId="210F4E1D">
             <wp:extent cx="6066046" cy="4198984"/>
@@ -640,6 +661,9 @@
     </w:p>
     <w:p>
       <w:r>
+        <w:rPr>
+          <w:noProof/>
+        </w:rPr>
         <w:lastRenderedPageBreak/>
         <w:drawing>
           <wp:inline distT="0" distB="0" distL="0" distR="0" wp14:anchorId="499B23B8" wp14:editId="5FB63298">
@@ -748,13 +772,8 @@
       <w:r>
         <w:t xml:space="preserve"> by a function named “</w:t>
       </w:r>
-      <w:proofErr w:type="spellStart"/>
-      <w:r>
-        <w:t>verify_cookie</w:t>
-      </w:r>
-      <w:proofErr w:type="spellEnd"/>
-      <w:r>
-        <w:t>()”</w:t>
+      <w:r>
+        <w:t>verify_cookie()”</w:t>
       </w:r>
       <w:r>
         <w:t>.</w:t>
@@ -1022,6 +1041,9 @@
     </w:p>
     <w:p>
       <w:r>
+        <w:rPr>
+          <w:noProof/>
+        </w:rPr>
         <w:drawing>
           <wp:inline distT="0" distB="0" distL="0" distR="0" wp14:anchorId="05E49807" wp14:editId="2DA8F09A">
             <wp:extent cx="7171041" cy="3398815"/>
@@ -1084,6 +1106,9 @@
     </w:p>
     <w:p>
       <w:r>
+        <w:rPr>
+          <w:noProof/>
+        </w:rPr>
         <w:drawing>
           <wp:inline distT="0" distB="0" distL="0" distR="0" wp14:anchorId="75A787CF" wp14:editId="29E09FE7">
             <wp:extent cx="2465284" cy="342930"/>
@@ -1222,6 +1247,9 @@
     </w:p>
     <w:p>
       <w:r>
+        <w:rPr>
+          <w:noProof/>
+        </w:rPr>
         <w:drawing>
           <wp:inline distT="0" distB="0" distL="0" distR="0" wp14:anchorId="561A1986" wp14:editId="42520B89">
             <wp:extent cx="4198984" cy="1466977"/>
@@ -1261,6 +1289,9 @@
     </w:p>
     <w:p>
       <w:r>
+        <w:rPr>
+          <w:noProof/>
+        </w:rPr>
         <w:drawing>
           <wp:inline distT="0" distB="0" distL="0" distR="0" wp14:anchorId="26967B7D" wp14:editId="20764A50">
             <wp:extent cx="2972058" cy="369602"/>
@@ -1378,6 +1409,9 @@
     </w:p>
     <w:p>
       <w:r>
+        <w:rPr>
+          <w:noProof/>
+        </w:rPr>
         <w:drawing>
           <wp:inline distT="0" distB="0" distL="0" distR="0" wp14:anchorId="3E4B1CEF" wp14:editId="4B1FF581">
             <wp:extent cx="1665114" cy="304826"/>
@@ -1422,6 +1456,9 @@
     </w:p>
     <w:p>
       <w:r>
+        <w:rPr>
+          <w:noProof/>
+        </w:rPr>
         <w:drawing>
           <wp:inline distT="0" distB="0" distL="0" distR="0" wp14:anchorId="70511A9B" wp14:editId="7276AD55">
             <wp:extent cx="4305673" cy="304826"/>
@@ -1671,10 +1708,10 @@
         <w:t xml:space="preserve">hash that connected </w:t>
       </w:r>
       <w:r>
-        <w:t>the user-agent, the “:” and the secret key so each time the part of the secret key will be one character long</w:t>
-      </w:r>
-      <w:r>
-        <w:t>.</w:t>
+        <w:t xml:space="preserve">the user-agent, the “:” and the secret key so each time </w:t>
+      </w:r>
+      <w:r>
+        <w:t>I will reveal only 1 character from the secret key.</w:t>
       </w:r>
     </w:p>
     <w:p>
@@ -1691,14 +1728,61 @@
       <w:r>
         <w:t>do this job:</w:t>
       </w:r>
-    </w:p>
-    <w:p/>
-    <w:p>
-      <w:r>
-        <w:t>I run this script and finally found the secret key!</w:t>
-      </w:r>
-    </w:p>
-    <w:p/>
+      <w:r>
+        <w:rPr>
+          <w:noProof/>
+        </w:rPr>
+        <w:t xml:space="preserve"> </w:t>
+      </w:r>
+      <w:r>
+        <w:drawing>
+          <wp:inline distT="0" distB="0" distL="0" distR="0" wp14:anchorId="451DB6D5" wp14:editId="46638F69">
+            <wp:extent cx="7556500" cy="6471920"/>
+            <wp:effectExtent l="0" t="0" r="6350" b="5080"/>
+            <wp:docPr id="2927349" name="תמונה 1"/>
+            <wp:cNvGraphicFramePr>
+              <a:graphicFrameLocks xmlns:a="http://schemas.openxmlformats.org/drawingml/2006/main" noChangeAspect="1"/>
+            </wp:cNvGraphicFramePr>
+            <a:graphic xmlns:a="http://schemas.openxmlformats.org/drawingml/2006/main">
+              <a:graphicData uri="http://schemas.openxmlformats.org/drawingml/2006/picture">
+                <pic:pic xmlns:pic="http://schemas.openxmlformats.org/drawingml/2006/picture">
+                  <pic:nvPicPr>
+                    <pic:cNvPr id="2927349" name=""/>
+                    <pic:cNvPicPr/>
+                  </pic:nvPicPr>
+                  <pic:blipFill>
+                    <a:blip r:embed="rId19"/>
+                    <a:stretch>
+                      <a:fillRect/>
+                    </a:stretch>
+                  </pic:blipFill>
+                  <pic:spPr>
+                    <a:xfrm>
+                      <a:off x="0" y="0"/>
+                      <a:ext cx="7556500" cy="6471920"/>
+                    </a:xfrm>
+                    <a:prstGeom prst="rect">
+                      <a:avLst/>
+                    </a:prstGeom>
+                  </pic:spPr>
+                </pic:pic>
+              </a:graphicData>
+            </a:graphic>
+          </wp:inline>
+        </w:drawing>
+      </w:r>
+    </w:p>
+    <w:p>
+      <w:r>
+        <w:t>I run this script and finally found the secret key</w:t>
+      </w:r>
+      <w:r>
+        <w:t xml:space="preserve"> which is: </w:t>
+      </w:r>
+      <w:r>
+        <w:t>THM{Traditional_Own_Crypto_is_Always_Surprising!_and_this_hopefully_is_not_easy_to_crack_e41d20b5b0989cac65ed4a090cace944bf30e6d3ab88f9d447f52fd2140525b9}</w:t>
+      </w:r>
+    </w:p>
     <w:p>
       <w:r>
         <w:t>And by doing so, I finished this challenge!</w:t>
@@ -2443,6 +2527,7 @@
   <w:style w:type="character" w:default="1" w:styleId="a0">
     <w:name w:val="Default Paragraph Font"/>
     <w:uiPriority w:val="1"/>
+    <w:semiHidden/>
     <w:unhideWhenUsed/>
   </w:style>
   <w:style w:type="table" w:default="1" w:styleId="a1">

</xml_diff>